<commit_message>
Backend: portada con aula, grupo, turno y especialidad
Co-Authored-By: Claude Sonnet 5.5 <noreply@anthropic.com>
</commit_message>
<xml_diff>
--- a/portada_word.docx
+++ b/portada_word.docx
@@ -509,7 +509,7 @@
                 <w:sz w:val="48"/>
                 <w:szCs w:val="48"/>
               </w:rPr>
-              <w:t>144</w:t>
+              <w:t>(AULA)</w:t>
             </w:r>
           </w:p>
         </w:tc>
@@ -542,7 +542,7 @@
                 <w:sz w:val="48"/>
                 <w:szCs w:val="48"/>
               </w:rPr>
-              <w:t>5V1</w:t>
+              <w:t>(GRUPO)</w:t>
             </w:r>
           </w:p>
         </w:tc>
@@ -575,7 +575,7 @@
                 <w:sz w:val="48"/>
                 <w:szCs w:val="48"/>
               </w:rPr>
-              <w:t>MATUTINO</w:t>
+              <w:t>(TURNO)</w:t>
             </w:r>
           </w:p>
         </w:tc>
@@ -631,7 +631,7 @@
           <w:szCs w:val="48"/>
           <w:u w:val="single"/>
         </w:rPr>
-        <w:t>Técnico en Inteligencia Artificial BPI</w:t>
+        <w:t>(ESPECIALIDAD)</w:t>
       </w:r>
     </w:p>
     <w:p>

</xml_diff>